<commit_message>
feat(resume): add meridian as public proof of the laravel stack
</commit_message>
<xml_diff>
--- a/public/resume/Allen-Padilla-Resume.docx
+++ b/public/resume/Allen-Padilla-Resume.docx
@@ -304,6 +304,33 @@
       </w:pPr>
       <w:r>
         <w:t xml:space="preserve">Private ideas stay in SQLite on the phone. Sync uses cursors and server-time watermarks, last write wins with a conflicted copy on a real collision. Postgres RLS covered by a 67-check suite.</w:t>
+      </w:r>
+    </w:p>
+    <w:p>
+      <w:pPr>
+        <w:pStyle w:val="Heading3"/>
+      </w:pPr>
+      <w:r>
+        <w:rPr>
+          <w:b/>
+          <w:bCs/>
+        </w:rPr>
+        <w:t xml:space="preserve">Meridian</w:t>
+      </w:r>
+      <w:r>
+        <w:t xml:space="preserve"> | Guild operations portal with Pest tests and CI, source at github.com/allen-padilla/Meridian</w:t>
+      </w:r>
+    </w:p>
+    <w:p>
+      <w:pPr>
+        <w:spacing w:after="20"/>
+      </w:pPr>
+      <w:r>
+        <w:rPr>
+          <w:i/>
+          <w:iCs/>
+        </w:rPr>
+        <w:t xml:space="preserve">Laravel, Inertia, React, and TypeScript, the same stack as the confidential member platform.</w:t>
       </w:r>
     </w:p>
     <w:p>

</xml_diff>

<commit_message>
feat(resume): start experience bullets with verbs
</commit_message>
<xml_diff>
--- a/public/resume/Allen-Padilla-Resume.docx
+++ b/public/resume/Allen-Padilla-Resume.docx
@@ -106,20 +106,20 @@
         <w:spacing w:after="20"/>
       </w:pPr>
       <w:r>
-        <w:t xml:space="preserve">Azure AD sign-in with directory groups mapped to app roles, so access changes when someone changes teams. An OAuth2 API feeds member data to the public website so nobody types the same thing twice.</w:t>
-      </w:r>
-    </w:p>
-    <w:p>
-      <w:pPr>
-        <w:pStyle w:val="ListParagraph"/>
-        <w:numPr>
-          <w:ilvl w:val="0"/>
-          <w:numId w:val="2"/>
-        </w:numPr>
-        <w:spacing w:after="20"/>
-      </w:pPr>
-      <w:r>
-        <w:t xml:space="preserve">Graduation ceremony portal (SvelteKit, Convex) used at the 2025 and 2026 ceremonies. Gown check-out by barcode, plus a stage scanner that puts each graduate on the projector from a local copy of the roster so a Wi-Fi drop doesn't stop the ceremony. 150+ graduates, every gown came back.</w:t>
+        <w:t xml:space="preserve">Wired sign-in to Azure AD with directory groups mapped to app roles, so access changes when someone changes teams. Built the OAuth2 API that feeds member data to the public website so nobody types the same thing twice.</w:t>
+      </w:r>
+    </w:p>
+    <w:p>
+      <w:pPr>
+        <w:pStyle w:val="ListParagraph"/>
+        <w:numPr>
+          <w:ilvl w:val="0"/>
+          <w:numId w:val="2"/>
+        </w:numPr>
+        <w:spacing w:after="20"/>
+      </w:pPr>
+      <w:r>
+        <w:t xml:space="preserve">Built and ran the graduation ceremony portal (SvelteKit, Convex) for the 2025 and 2026 ceremonies: barcode gown check-out, and a stage scanner that puts each graduate on the projector from a local copy of the roster so a Wi-Fi drop doesn't stop the ceremony. 150+ graduates, every gown came back.</w:t>
       </w:r>
     </w:p>
     <w:p>
@@ -158,7 +158,7 @@
         <w:spacing w:after="20"/>
       </w:pPr>
       <w:r>
-        <w:t xml:space="preserve">Run the infrastructure: self-hosted Coolify on a VPS, Docker Compose, nginx, and firewall rules so internal apps stay internal. Handle fixes, enhancements, and vulnerabilities across every production app.</w:t>
+        <w:t xml:space="preserve">Run the infrastructure, self-hosted Coolify on a VPS, Docker Compose, nginx, and firewall rules so internal apps stay internal, and handle fixes, enhancements, and vulnerabilities across every production app.</w:t>
       </w:r>
     </w:p>
     <w:p>
@@ -211,7 +211,7 @@
         <w:spacing w:after="20"/>
       </w:pPr>
       <w:r>
-        <w:t xml:space="preserve">Asset tracking with a chain-of-custody history, orders and RMAs with tax, payments, CSV import, and PDF invoices, and a role and permission layer so admins, supervisors, and floor staff each see only their modules.</w:t>
+        <w:t xml:space="preserve">Added asset tracking with a chain-of-custody history, orders and RMAs with tax, payments, CSV import, and PDF invoices, and wrote the role and permission layer so admins, supervisors, and floor staff each see only their modules.</w:t>
       </w:r>
     </w:p>
     <w:p>

</xml_diff>

<commit_message>
feat(resume): vary the verbs on the in-progress bullets
</commit_message>
<xml_diff>
--- a/public/resume/Allen-Padilla-Resume.docx
+++ b/public/resume/Allen-Padilla-Resume.docx
@@ -119,33 +119,33 @@
         <w:spacing w:after="20"/>
       </w:pPr>
       <w:r>
-        <w:t xml:space="preserve">Built and ran the graduation ceremony portal (SvelteKit, Convex) for the 2025 and 2026 ceremonies: barcode gown check-out, and a stage scanner that puts each graduate on the projector from a local copy of the roster so a Wi-Fi drop doesn't stop the ceremony. 150+ graduates, every gown came back.</w:t>
-      </w:r>
-    </w:p>
-    <w:p>
-      <w:pPr>
-        <w:pStyle w:val="ListParagraph"/>
-        <w:numPr>
-          <w:ilvl w:val="0"/>
-          <w:numId w:val="2"/>
-        </w:numPr>
-        <w:spacing w:after="20"/>
-      </w:pPr>
-      <w:r>
-        <w:t xml:space="preserve">Building Homeland Map, a 3D relief map of Canada for a museum kiosk (Three.js, d3-geo, Express, SQLite). Terrain extruded from GMTED2010 elevation data, great-circle connections labelled with distance, marker clustering so nearby places stay tappable, and a pinch dead zone so a two-finger rotate doesn't zoom.</w:t>
-      </w:r>
-    </w:p>
-    <w:p>
-      <w:pPr>
-        <w:pStyle w:val="ListParagraph"/>
-        <w:numPr>
-          <w:ilvl w:val="0"/>
-          <w:numId w:val="2"/>
-        </w:numPr>
-        <w:spacing w:after="20"/>
-      </w:pPr>
-      <w:r>
-        <w:t xml:space="preserve">Building the public website for the Métis Veterans Legacy Program (Next.js, React, Strapi, TipTap). Staff publish news, recipient profiles, and commemoration projects themselves, with drafts and no developer.</w:t>
+        <w:t xml:space="preserve">Ran both graduation ceremonies on a SvelteKit and Convex portal: barcode gown check-out, and a stage scanner that puts each graduate on the projector from a local copy of the roster so a Wi-Fi drop doesn't stop the ceremony. 150+ graduates, every gown came back.</w:t>
+      </w:r>
+    </w:p>
+    <w:p>
+      <w:pPr>
+        <w:pStyle w:val="ListParagraph"/>
+        <w:numPr>
+          <w:ilvl w:val="0"/>
+          <w:numId w:val="2"/>
+        </w:numPr>
+        <w:spacing w:after="20"/>
+      </w:pPr>
+      <w:r>
+        <w:t xml:space="preserve">Prototyping Homeland Map, a 3D relief map of Canada for a museum kiosk (Three.js, d3-geo, Express, SQLite). Terrain extruded from GMTED2010 elevation data, great-circle connections labelled with distance, marker clustering so nearby places stay tappable, and a pinch dead zone so a two-finger rotate doesn't zoom.</w:t>
+      </w:r>
+    </w:p>
+    <w:p>
+      <w:pPr>
+        <w:pStyle w:val="ListParagraph"/>
+        <w:numPr>
+          <w:ilvl w:val="0"/>
+          <w:numId w:val="2"/>
+        </w:numPr>
+        <w:spacing w:after="20"/>
+      </w:pPr>
+      <w:r>
+        <w:t xml:space="preserve">Moving the Métis Veterans Legacy Program's website from WordPress to Next.js and Strapi, so staff publish news, recipient profiles, and commemoration projects themselves, with drafts and no developer.</w:t>
       </w:r>
     </w:p>
     <w:p>

</xml_diff>